<commit_message>
commit chnages in system desugn
</commit_message>
<xml_diff>
--- a/Documents/03-Architecture/03-EnterpriseArchitecture/01-TOGAF/TOGAF_Module1_Study_Guide.docx
+++ b/Documents/03-Architecture/03-EnterpriseArchitecture/01-TOGAF/TOGAF_Module1_Study_Guide.docx
@@ -154,7 +154,7 @@
           <w:color w:val="1F4E78"/>
         </w:rPr>
         <w:drawing>
-          <wp:anchor behindDoc="0" distT="0" distB="0" distL="0" distR="0" simplePos="0" locked="0" layoutInCell="0" allowOverlap="1" relativeHeight="2">
+          <wp:anchor distT="0" distB="0" distL="0" distR="0" simplePos="0" relativeHeight="2" behindDoc="0" locked="0" layoutInCell="0" allowOverlap="1">
             <wp:simplePos x="0" y="0"/>
             <wp:positionH relativeFrom="column">
               <wp:align>center</wp:align>
@@ -165,7 +165,7 @@
             <wp:extent cx="5943600" cy="3962400"/>
             <wp:effectExtent l="0" t="0" r="0" b="0"/>
             <wp:wrapSquare wrapText="largest"/>
-            <wp:docPr id="1" name="Image1" descr=""/>
+            <wp:docPr id="1" name="Image1"/>
             <wp:cNvGraphicFramePr>
               <a:graphicFrameLocks xmlns:a="http://schemas.openxmlformats.org/drawingml/2006/main" noChangeAspect="1"/>
             </wp:cNvGraphicFramePr>
@@ -173,7 +173,7 @@
               <a:graphicData uri="http://schemas.openxmlformats.org/drawingml/2006/picture">
                 <pic:pic xmlns:pic="http://schemas.openxmlformats.org/drawingml/2006/picture">
                   <pic:nvPicPr>
-                    <pic:cNvPr id="1" name="Image1" descr=""/>
+                    <pic:cNvPr id="1" name="Image1"/>
                     <pic:cNvPicPr>
                       <a:picLocks noChangeAspect="1" noChangeArrowheads="1"/>
                     </pic:cNvPicPr>
@@ -1052,8 +1052,8 @@
         </w:tblCellMar>
       </w:tblPr>
       <w:tblGrid>
-        <w:gridCol w:w="1829"/>
-        <w:gridCol w:w="3871"/>
+        <w:gridCol w:w="1828"/>
+        <w:gridCol w:w="3872"/>
         <w:gridCol w:w="3660"/>
       </w:tblGrid>
       <w:tr>
@@ -1063,7 +1063,7 @@
         </w:trPr>
         <w:tc>
           <w:tcPr>
-            <w:tcW w:w="1829" w:type="dxa"/>
+            <w:tcW w:w="1828" w:type="dxa"/>
             <w:tcBorders>
               <w:top w:val="single" w:sz="4" w:space="0" w:color="999999"/>
               <w:left w:val="single" w:sz="4" w:space="0" w:color="999999"/>
@@ -1094,7 +1094,7 @@
         </w:tc>
         <w:tc>
           <w:tcPr>
-            <w:tcW w:w="3871" w:type="dxa"/>
+            <w:tcW w:w="3872" w:type="dxa"/>
             <w:tcBorders>
               <w:top w:val="single" w:sz="4" w:space="0" w:color="999999"/>
               <w:left w:val="single" w:sz="4" w:space="0" w:color="999999"/>
@@ -1159,7 +1159,7 @@
         <w:trPr/>
         <w:tc>
           <w:tcPr>
-            <w:tcW w:w="1829" w:type="dxa"/>
+            <w:tcW w:w="1828" w:type="dxa"/>
             <w:tcBorders>
               <w:top w:val="single" w:sz="4" w:space="0" w:color="999999"/>
               <w:left w:val="single" w:sz="4" w:space="0" w:color="999999"/>
@@ -1194,7 +1194,7 @@
         </w:tc>
         <w:tc>
           <w:tcPr>
-            <w:tcW w:w="3871" w:type="dxa"/>
+            <w:tcW w:w="3872" w:type="dxa"/>
             <w:tcBorders>
               <w:top w:val="single" w:sz="4" w:space="0" w:color="999999"/>
               <w:left w:val="single" w:sz="4" w:space="0" w:color="999999"/>
@@ -1267,7 +1267,7 @@
         <w:trPr/>
         <w:tc>
           <w:tcPr>
-            <w:tcW w:w="1829" w:type="dxa"/>
+            <w:tcW w:w="1828" w:type="dxa"/>
             <w:tcBorders>
               <w:top w:val="single" w:sz="4" w:space="0" w:color="999999"/>
               <w:left w:val="single" w:sz="4" w:space="0" w:color="999999"/>
@@ -1302,7 +1302,7 @@
         </w:tc>
         <w:tc>
           <w:tcPr>
-            <w:tcW w:w="3871" w:type="dxa"/>
+            <w:tcW w:w="3872" w:type="dxa"/>
             <w:tcBorders>
               <w:top w:val="single" w:sz="4" w:space="0" w:color="999999"/>
               <w:left w:val="single" w:sz="4" w:space="0" w:color="999999"/>
@@ -1375,7 +1375,7 @@
         <w:trPr/>
         <w:tc>
           <w:tcPr>
-            <w:tcW w:w="1829" w:type="dxa"/>
+            <w:tcW w:w="1828" w:type="dxa"/>
             <w:tcBorders>
               <w:top w:val="single" w:sz="4" w:space="0" w:color="999999"/>
               <w:left w:val="single" w:sz="4" w:space="0" w:color="999999"/>
@@ -1410,7 +1410,7 @@
         </w:tc>
         <w:tc>
           <w:tcPr>
-            <w:tcW w:w="3871" w:type="dxa"/>
+            <w:tcW w:w="3872" w:type="dxa"/>
             <w:tcBorders>
               <w:top w:val="single" w:sz="4" w:space="0" w:color="999999"/>
               <w:left w:val="single" w:sz="4" w:space="0" w:color="999999"/>
@@ -1483,7 +1483,7 @@
         <w:trPr/>
         <w:tc>
           <w:tcPr>
-            <w:tcW w:w="1829" w:type="dxa"/>
+            <w:tcW w:w="1828" w:type="dxa"/>
             <w:tcBorders>
               <w:top w:val="single" w:sz="4" w:space="0" w:color="999999"/>
               <w:left w:val="single" w:sz="4" w:space="0" w:color="999999"/>
@@ -1518,7 +1518,7 @@
         </w:tc>
         <w:tc>
           <w:tcPr>
-            <w:tcW w:w="3871" w:type="dxa"/>
+            <w:tcW w:w="3872" w:type="dxa"/>
             <w:tcBorders>
               <w:top w:val="single" w:sz="4" w:space="0" w:color="999999"/>
               <w:left w:val="single" w:sz="4" w:space="0" w:color="999999"/>
@@ -1591,7 +1591,7 @@
         <w:trPr/>
         <w:tc>
           <w:tcPr>
-            <w:tcW w:w="1829" w:type="dxa"/>
+            <w:tcW w:w="1828" w:type="dxa"/>
             <w:tcBorders>
               <w:top w:val="single" w:sz="4" w:space="0" w:color="999999"/>
               <w:left w:val="single" w:sz="4" w:space="0" w:color="999999"/>
@@ -1626,7 +1626,7 @@
         </w:tc>
         <w:tc>
           <w:tcPr>
-            <w:tcW w:w="3871" w:type="dxa"/>
+            <w:tcW w:w="3872" w:type="dxa"/>
             <w:tcBorders>
               <w:top w:val="single" w:sz="4" w:space="0" w:color="999999"/>
               <w:left w:val="single" w:sz="4" w:space="0" w:color="999999"/>
@@ -1699,7 +1699,7 @@
         <w:trPr/>
         <w:tc>
           <w:tcPr>
-            <w:tcW w:w="1829" w:type="dxa"/>
+            <w:tcW w:w="1828" w:type="dxa"/>
             <w:tcBorders>
               <w:top w:val="single" w:sz="4" w:space="0" w:color="999999"/>
               <w:left w:val="single" w:sz="4" w:space="0" w:color="999999"/>
@@ -1734,7 +1734,7 @@
         </w:tc>
         <w:tc>
           <w:tcPr>
-            <w:tcW w:w="3871" w:type="dxa"/>
+            <w:tcW w:w="3872" w:type="dxa"/>
             <w:tcBorders>
               <w:top w:val="single" w:sz="4" w:space="0" w:color="999999"/>
               <w:left w:val="single" w:sz="4" w:space="0" w:color="999999"/>
@@ -1807,7 +1807,7 @@
         <w:trPr/>
         <w:tc>
           <w:tcPr>
-            <w:tcW w:w="1829" w:type="dxa"/>
+            <w:tcW w:w="1828" w:type="dxa"/>
             <w:tcBorders>
               <w:top w:val="single" w:sz="4" w:space="0" w:color="999999"/>
               <w:left w:val="single" w:sz="4" w:space="0" w:color="999999"/>
@@ -1842,7 +1842,7 @@
         </w:tc>
         <w:tc>
           <w:tcPr>
-            <w:tcW w:w="3871" w:type="dxa"/>
+            <w:tcW w:w="3872" w:type="dxa"/>
             <w:tcBorders>
               <w:top w:val="single" w:sz="4" w:space="0" w:color="999999"/>
               <w:left w:val="single" w:sz="4" w:space="0" w:color="999999"/>
@@ -1915,7 +1915,7 @@
         <w:trPr/>
         <w:tc>
           <w:tcPr>
-            <w:tcW w:w="1829" w:type="dxa"/>
+            <w:tcW w:w="1828" w:type="dxa"/>
             <w:tcBorders>
               <w:top w:val="single" w:sz="4" w:space="0" w:color="999999"/>
               <w:left w:val="single" w:sz="4" w:space="0" w:color="999999"/>
@@ -1950,7 +1950,7 @@
         </w:tc>
         <w:tc>
           <w:tcPr>
-            <w:tcW w:w="3871" w:type="dxa"/>
+            <w:tcW w:w="3872" w:type="dxa"/>
             <w:tcBorders>
               <w:top w:val="single" w:sz="4" w:space="0" w:color="999999"/>
               <w:left w:val="single" w:sz="4" w:space="0" w:color="999999"/>
@@ -3923,7 +3923,7 @@
         <w:pStyle w:val="ListParagraph"/>
         <w:numPr>
           <w:ilvl w:val="0"/>
-          <w:numId w:val="13"/>
+          <w:numId w:val="5"/>
         </w:numPr>
         <w:spacing w:lineRule="auto" w:line="281" w:before="0" w:after="80"/>
         <w:rPr>
@@ -3942,7 +3942,7 @@
         <w:pStyle w:val="ListParagraph"/>
         <w:numPr>
           <w:ilvl w:val="0"/>
-          <w:numId w:val="14"/>
+          <w:numId w:val="5"/>
         </w:numPr>
         <w:spacing w:lineRule="auto" w:line="281" w:before="0" w:after="80"/>
         <w:rPr>
@@ -3961,7 +3961,7 @@
         <w:pStyle w:val="ListParagraph"/>
         <w:numPr>
           <w:ilvl w:val="0"/>
-          <w:numId w:val="15"/>
+          <w:numId w:val="5"/>
         </w:numPr>
         <w:spacing w:lineRule="auto" w:line="281" w:before="0" w:after="80"/>
         <w:rPr>
@@ -3980,7 +3980,7 @@
         <w:pStyle w:val="ListParagraph"/>
         <w:numPr>
           <w:ilvl w:val="0"/>
-          <w:numId w:val="16"/>
+          <w:numId w:val="5"/>
         </w:numPr>
         <w:spacing w:lineRule="auto" w:line="281" w:before="0" w:after="80"/>
         <w:rPr>
@@ -3999,7 +3999,7 @@
         <w:pStyle w:val="ListParagraph"/>
         <w:numPr>
           <w:ilvl w:val="0"/>
-          <w:numId w:val="17"/>
+          <w:numId w:val="5"/>
         </w:numPr>
         <w:spacing w:lineRule="auto" w:line="281" w:before="0" w:after="80"/>
         <w:rPr>
@@ -4018,7 +4018,7 @@
         <w:pStyle w:val="ListParagraph"/>
         <w:numPr>
           <w:ilvl w:val="0"/>
-          <w:numId w:val="18"/>
+          <w:numId w:val="5"/>
         </w:numPr>
         <w:spacing w:lineRule="auto" w:line="281" w:before="0" w:after="80"/>
         <w:rPr>
@@ -4765,8 +4765,8 @@
         </w:tblCellMar>
       </w:tblPr>
       <w:tblGrid>
-        <w:gridCol w:w="1889"/>
-        <w:gridCol w:w="3711"/>
+        <w:gridCol w:w="1888"/>
+        <w:gridCol w:w="3712"/>
         <w:gridCol w:w="3760"/>
       </w:tblGrid>
       <w:tr>
@@ -4775,7 +4775,7 @@
         </w:trPr>
         <w:tc>
           <w:tcPr>
-            <w:tcW w:w="1889" w:type="dxa"/>
+            <w:tcW w:w="1888" w:type="dxa"/>
             <w:tcBorders>
               <w:top w:val="single" w:sz="4" w:space="0" w:color="999999"/>
               <w:left w:val="single" w:sz="4" w:space="0" w:color="999999"/>
@@ -4804,7 +4804,7 @@
         </w:tc>
         <w:tc>
           <w:tcPr>
-            <w:tcW w:w="3711" w:type="dxa"/>
+            <w:tcW w:w="3712" w:type="dxa"/>
             <w:tcBorders>
               <w:top w:val="single" w:sz="4" w:space="0" w:color="999999"/>
               <w:left w:val="single" w:sz="4" w:space="0" w:color="999999"/>
@@ -4865,7 +4865,7 @@
         <w:trPr/>
         <w:tc>
           <w:tcPr>
-            <w:tcW w:w="1889" w:type="dxa"/>
+            <w:tcW w:w="1888" w:type="dxa"/>
             <w:tcBorders>
               <w:top w:val="single" w:sz="4" w:space="0" w:color="999999"/>
               <w:left w:val="single" w:sz="4" w:space="0" w:color="999999"/>
@@ -4896,7 +4896,7 @@
         </w:tc>
         <w:tc>
           <w:tcPr>
-            <w:tcW w:w="3711" w:type="dxa"/>
+            <w:tcW w:w="3712" w:type="dxa"/>
             <w:tcBorders>
               <w:top w:val="single" w:sz="4" w:space="0" w:color="999999"/>
               <w:left w:val="single" w:sz="4" w:space="0" w:color="999999"/>
@@ -4961,7 +4961,7 @@
         <w:trPr/>
         <w:tc>
           <w:tcPr>
-            <w:tcW w:w="1889" w:type="dxa"/>
+            <w:tcW w:w="1888" w:type="dxa"/>
             <w:tcBorders>
               <w:top w:val="single" w:sz="4" w:space="0" w:color="999999"/>
               <w:left w:val="single" w:sz="4" w:space="0" w:color="999999"/>
@@ -4992,7 +4992,7 @@
         </w:tc>
         <w:tc>
           <w:tcPr>
-            <w:tcW w:w="3711" w:type="dxa"/>
+            <w:tcW w:w="3712" w:type="dxa"/>
             <w:tcBorders>
               <w:top w:val="single" w:sz="4" w:space="0" w:color="999999"/>
               <w:left w:val="single" w:sz="4" w:space="0" w:color="999999"/>
@@ -5057,7 +5057,7 @@
         <w:trPr/>
         <w:tc>
           <w:tcPr>
-            <w:tcW w:w="1889" w:type="dxa"/>
+            <w:tcW w:w="1888" w:type="dxa"/>
             <w:tcBorders>
               <w:top w:val="single" w:sz="4" w:space="0" w:color="999999"/>
               <w:left w:val="single" w:sz="4" w:space="0" w:color="999999"/>
@@ -5088,7 +5088,7 @@
         </w:tc>
         <w:tc>
           <w:tcPr>
-            <w:tcW w:w="3711" w:type="dxa"/>
+            <w:tcW w:w="3712" w:type="dxa"/>
             <w:tcBorders>
               <w:top w:val="single" w:sz="4" w:space="0" w:color="999999"/>
               <w:left w:val="single" w:sz="4" w:space="0" w:color="999999"/>
@@ -5153,7 +5153,7 @@
         <w:trPr/>
         <w:tc>
           <w:tcPr>
-            <w:tcW w:w="1889" w:type="dxa"/>
+            <w:tcW w:w="1888" w:type="dxa"/>
             <w:tcBorders>
               <w:top w:val="single" w:sz="4" w:space="0" w:color="999999"/>
               <w:left w:val="single" w:sz="4" w:space="0" w:color="999999"/>
@@ -5184,7 +5184,7 @@
         </w:tc>
         <w:tc>
           <w:tcPr>
-            <w:tcW w:w="3711" w:type="dxa"/>
+            <w:tcW w:w="3712" w:type="dxa"/>
             <w:tcBorders>
               <w:top w:val="single" w:sz="4" w:space="0" w:color="999999"/>
               <w:left w:val="single" w:sz="4" w:space="0" w:color="999999"/>
@@ -5249,7 +5249,7 @@
         <w:trPr/>
         <w:tc>
           <w:tcPr>
-            <w:tcW w:w="1889" w:type="dxa"/>
+            <w:tcW w:w="1888" w:type="dxa"/>
             <w:tcBorders>
               <w:top w:val="single" w:sz="4" w:space="0" w:color="999999"/>
               <w:left w:val="single" w:sz="4" w:space="0" w:color="999999"/>
@@ -5280,7 +5280,7 @@
         </w:tc>
         <w:tc>
           <w:tcPr>
-            <w:tcW w:w="3711" w:type="dxa"/>
+            <w:tcW w:w="3712" w:type="dxa"/>
             <w:tcBorders>
               <w:top w:val="single" w:sz="4" w:space="0" w:color="999999"/>
               <w:left w:val="single" w:sz="4" w:space="0" w:color="999999"/>
@@ -5345,7 +5345,7 @@
         <w:trPr/>
         <w:tc>
           <w:tcPr>
-            <w:tcW w:w="1889" w:type="dxa"/>
+            <w:tcW w:w="1888" w:type="dxa"/>
             <w:tcBorders>
               <w:top w:val="single" w:sz="4" w:space="0" w:color="999999"/>
               <w:left w:val="single" w:sz="4" w:space="0" w:color="999999"/>
@@ -5376,7 +5376,7 @@
         </w:tc>
         <w:tc>
           <w:tcPr>
-            <w:tcW w:w="3711" w:type="dxa"/>
+            <w:tcW w:w="3712" w:type="dxa"/>
             <w:tcBorders>
               <w:top w:val="single" w:sz="4" w:space="0" w:color="999999"/>
               <w:left w:val="single" w:sz="4" w:space="0" w:color="999999"/>
@@ -6594,7 +6594,7 @@
       </w:tblPr>
       <w:tblGrid>
         <w:gridCol w:w="2398"/>
-        <w:gridCol w:w="6961"/>
+        <w:gridCol w:w="6962"/>
       </w:tblGrid>
       <w:tr>
         <w:trPr>
@@ -6634,7 +6634,7 @@
         </w:tc>
         <w:tc>
           <w:tcPr>
-            <w:tcW w:w="6961" w:type="dxa"/>
+            <w:tcW w:w="6962" w:type="dxa"/>
             <w:tcBorders>
               <w:top w:val="single" w:sz="4" w:space="0" w:color="999999"/>
               <w:left w:val="single" w:sz="4" w:space="0" w:color="999999"/>
@@ -6703,7 +6703,7 @@
         </w:tc>
         <w:tc>
           <w:tcPr>
-            <w:tcW w:w="6961" w:type="dxa"/>
+            <w:tcW w:w="6962" w:type="dxa"/>
             <w:tcBorders>
               <w:top w:val="single" w:sz="4" w:space="0" w:color="999999"/>
               <w:left w:val="single" w:sz="4" w:space="0" w:color="999999"/>
@@ -6774,7 +6774,7 @@
         </w:tc>
         <w:tc>
           <w:tcPr>
-            <w:tcW w:w="6961" w:type="dxa"/>
+            <w:tcW w:w="6962" w:type="dxa"/>
             <w:tcBorders>
               <w:top w:val="single" w:sz="4" w:space="0" w:color="999999"/>
               <w:left w:val="single" w:sz="4" w:space="0" w:color="999999"/>
@@ -6845,7 +6845,7 @@
         </w:tc>
         <w:tc>
           <w:tcPr>
-            <w:tcW w:w="6961" w:type="dxa"/>
+            <w:tcW w:w="6962" w:type="dxa"/>
             <w:tcBorders>
               <w:top w:val="single" w:sz="4" w:space="0" w:color="999999"/>
               <w:left w:val="single" w:sz="4" w:space="0" w:color="999999"/>
@@ -6916,7 +6916,7 @@
         </w:tc>
         <w:tc>
           <w:tcPr>
-            <w:tcW w:w="6961" w:type="dxa"/>
+            <w:tcW w:w="6962" w:type="dxa"/>
             <w:tcBorders>
               <w:top w:val="single" w:sz="4" w:space="0" w:color="999999"/>
               <w:left w:val="single" w:sz="4" w:space="0" w:color="999999"/>
@@ -6987,7 +6987,7 @@
         </w:tc>
         <w:tc>
           <w:tcPr>
-            <w:tcW w:w="6961" w:type="dxa"/>
+            <w:tcW w:w="6962" w:type="dxa"/>
             <w:tcBorders>
               <w:top w:val="single" w:sz="4" w:space="0" w:color="999999"/>
               <w:left w:val="single" w:sz="4" w:space="0" w:color="999999"/>
@@ -7734,7 +7734,7 @@
       </w:tblPr>
       <w:tblGrid>
         <w:gridCol w:w="2010"/>
-        <w:gridCol w:w="7349"/>
+        <w:gridCol w:w="7350"/>
       </w:tblGrid>
       <w:tr>
         <w:trPr>
@@ -7773,7 +7773,7 @@
         </w:tc>
         <w:tc>
           <w:tcPr>
-            <w:tcW w:w="7349" w:type="dxa"/>
+            <w:tcW w:w="7350" w:type="dxa"/>
             <w:tcBorders>
               <w:top w:val="single" w:sz="4" w:space="0" w:color="999999"/>
               <w:left w:val="single" w:sz="4" w:space="0" w:color="999999"/>
@@ -7842,7 +7842,7 @@
         </w:tc>
         <w:tc>
           <w:tcPr>
-            <w:tcW w:w="7349" w:type="dxa"/>
+            <w:tcW w:w="7350" w:type="dxa"/>
             <w:tcBorders>
               <w:top w:val="single" w:sz="4" w:space="0" w:color="999999"/>
               <w:left w:val="single" w:sz="4" w:space="0" w:color="999999"/>
@@ -7915,7 +7915,7 @@
         </w:tc>
         <w:tc>
           <w:tcPr>
-            <w:tcW w:w="7349" w:type="dxa"/>
+            <w:tcW w:w="7350" w:type="dxa"/>
             <w:tcBorders>
               <w:top w:val="single" w:sz="4" w:space="0" w:color="999999"/>
               <w:left w:val="single" w:sz="4" w:space="0" w:color="999999"/>
@@ -7988,7 +7988,7 @@
         </w:tc>
         <w:tc>
           <w:tcPr>
-            <w:tcW w:w="7349" w:type="dxa"/>
+            <w:tcW w:w="7350" w:type="dxa"/>
             <w:tcBorders>
               <w:top w:val="single" w:sz="4" w:space="0" w:color="999999"/>
               <w:left w:val="single" w:sz="4" w:space="0" w:color="999999"/>
@@ -8061,7 +8061,7 @@
         </w:tc>
         <w:tc>
           <w:tcPr>
-            <w:tcW w:w="7349" w:type="dxa"/>
+            <w:tcW w:w="7350" w:type="dxa"/>
             <w:tcBorders>
               <w:top w:val="single" w:sz="4" w:space="0" w:color="999999"/>
               <w:left w:val="single" w:sz="4" w:space="0" w:color="999999"/>
@@ -8134,7 +8134,7 @@
         </w:tc>
         <w:tc>
           <w:tcPr>
-            <w:tcW w:w="7349" w:type="dxa"/>
+            <w:tcW w:w="7350" w:type="dxa"/>
             <w:tcBorders>
               <w:top w:val="single" w:sz="4" w:space="0" w:color="999999"/>
               <w:left w:val="single" w:sz="4" w:space="0" w:color="999999"/>
@@ -8207,7 +8207,7 @@
         </w:tc>
         <w:tc>
           <w:tcPr>
-            <w:tcW w:w="7349" w:type="dxa"/>
+            <w:tcW w:w="7350" w:type="dxa"/>
             <w:tcBorders>
               <w:top w:val="single" w:sz="4" w:space="0" w:color="999999"/>
               <w:left w:val="single" w:sz="4" w:space="0" w:color="999999"/>
@@ -8505,7 +8505,7 @@
         <w:gridCol w:w="1800"/>
         <w:gridCol w:w="1613"/>
         <w:gridCol w:w="1613"/>
-        <w:gridCol w:w="1614"/>
+        <w:gridCol w:w="1615"/>
         <w:gridCol w:w="1609"/>
       </w:tblGrid>
       <w:tr>
@@ -8638,7 +8638,7 @@
         </w:tc>
         <w:tc>
           <w:tcPr>
-            <w:tcW w:w="1614" w:type="dxa"/>
+            <w:tcW w:w="1615" w:type="dxa"/>
             <w:tcBorders>
               <w:top w:val="single" w:sz="4" w:space="0" w:color="999999"/>
               <w:left w:val="single" w:sz="4" w:space="0" w:color="999999"/>
@@ -8843,7 +8843,7 @@
         </w:tc>
         <w:tc>
           <w:tcPr>
-            <w:tcW w:w="1614" w:type="dxa"/>
+            <w:tcW w:w="1615" w:type="dxa"/>
             <w:tcBorders>
               <w:top w:val="single" w:sz="4" w:space="0" w:color="999999"/>
               <w:left w:val="single" w:sz="4" w:space="0" w:color="999999"/>
@@ -9056,7 +9056,7 @@
         </w:tc>
         <w:tc>
           <w:tcPr>
-            <w:tcW w:w="1614" w:type="dxa"/>
+            <w:tcW w:w="1615" w:type="dxa"/>
             <w:tcBorders>
               <w:top w:val="single" w:sz="4" w:space="0" w:color="999999"/>
               <w:left w:val="single" w:sz="4" w:space="0" w:color="999999"/>
@@ -9269,7 +9269,7 @@
         </w:tc>
         <w:tc>
           <w:tcPr>
-            <w:tcW w:w="1614" w:type="dxa"/>
+            <w:tcW w:w="1615" w:type="dxa"/>
             <w:tcBorders>
               <w:top w:val="single" w:sz="4" w:space="0" w:color="999999"/>
               <w:left w:val="single" w:sz="4" w:space="0" w:color="999999"/>
@@ -9482,7 +9482,7 @@
         </w:tc>
         <w:tc>
           <w:tcPr>
-            <w:tcW w:w="1614" w:type="dxa"/>
+            <w:tcW w:w="1615" w:type="dxa"/>
             <w:tcBorders>
               <w:top w:val="single" w:sz="4" w:space="0" w:color="999999"/>
               <w:left w:val="single" w:sz="4" w:space="0" w:color="999999"/>
@@ -9695,7 +9695,7 @@
         </w:tc>
         <w:tc>
           <w:tcPr>
-            <w:tcW w:w="1614" w:type="dxa"/>
+            <w:tcW w:w="1615" w:type="dxa"/>
             <w:tcBorders>
               <w:top w:val="single" w:sz="4" w:space="0" w:color="999999"/>
               <w:left w:val="single" w:sz="4" w:space="0" w:color="999999"/>
@@ -9908,7 +9908,7 @@
         </w:tc>
         <w:tc>
           <w:tcPr>
-            <w:tcW w:w="1614" w:type="dxa"/>
+            <w:tcW w:w="1615" w:type="dxa"/>
             <w:tcBorders>
               <w:top w:val="single" w:sz="4" w:space="0" w:color="999999"/>
               <w:left w:val="single" w:sz="4" w:space="0" w:color="999999"/>
@@ -10121,7 +10121,7 @@
         </w:tc>
         <w:tc>
           <w:tcPr>
-            <w:tcW w:w="1614" w:type="dxa"/>
+            <w:tcW w:w="1615" w:type="dxa"/>
             <w:tcBorders>
               <w:top w:val="single" w:sz="4" w:space="0" w:color="999999"/>
               <w:left w:val="single" w:sz="4" w:space="0" w:color="999999"/>
@@ -10301,7 +10301,32 @@
       <w:pPr>
         <w:pStyle w:val="Heading1"/>
         <w:spacing w:before="0" w:after="200"/>
-        <w:rPr/>
+        <w:rPr>
+          <w:b/>
+          <w:bCs/>
+          <w:color w:val="1F4E78"/>
+        </w:rPr>
+      </w:pPr>
+      <w:r>
+        <w:rPr>
+          <w:b/>
+          <w:bCs/>
+          <w:color w:val="1F4E78"/>
+        </w:rPr>
+      </w:r>
+      <w:r>
+        <w:br w:type="page"/>
+      </w:r>
+    </w:p>
+    <w:p>
+      <w:pPr>
+        <w:pStyle w:val="Heading1"/>
+        <w:spacing w:before="0" w:after="200"/>
+        <w:rPr>
+          <w:b/>
+          <w:bCs/>
+          <w:color w:val="1F4E78"/>
+        </w:rPr>
       </w:pPr>
       <w:r>
         <w:rPr>
@@ -12195,7 +12220,7 @@
       </w:tblPr>
       <w:tblGrid>
         <w:gridCol w:w="3498"/>
-        <w:gridCol w:w="5861"/>
+        <w:gridCol w:w="5862"/>
       </w:tblGrid>
       <w:tr>
         <w:trPr>
@@ -12236,7 +12261,7 @@
         </w:tc>
         <w:tc>
           <w:tcPr>
-            <w:tcW w:w="5861" w:type="dxa"/>
+            <w:tcW w:w="5862" w:type="dxa"/>
             <w:tcBorders>
               <w:top w:val="single" w:sz="4" w:space="0" w:color="999999"/>
               <w:left w:val="single" w:sz="4" w:space="0" w:color="999999"/>
@@ -12307,7 +12332,7 @@
         </w:tc>
         <w:tc>
           <w:tcPr>
-            <w:tcW w:w="5861" w:type="dxa"/>
+            <w:tcW w:w="5862" w:type="dxa"/>
             <w:tcBorders>
               <w:top w:val="single" w:sz="4" w:space="0" w:color="999999"/>
               <w:left w:val="single" w:sz="4" w:space="0" w:color="999999"/>
@@ -12380,7 +12405,7 @@
         </w:tc>
         <w:tc>
           <w:tcPr>
-            <w:tcW w:w="5861" w:type="dxa"/>
+            <w:tcW w:w="5862" w:type="dxa"/>
             <w:tcBorders>
               <w:top w:val="single" w:sz="4" w:space="0" w:color="999999"/>
               <w:left w:val="single" w:sz="4" w:space="0" w:color="999999"/>
@@ -12453,7 +12478,7 @@
         </w:tc>
         <w:tc>
           <w:tcPr>
-            <w:tcW w:w="5861" w:type="dxa"/>
+            <w:tcW w:w="5862" w:type="dxa"/>
             <w:tcBorders>
               <w:top w:val="single" w:sz="4" w:space="0" w:color="999999"/>
               <w:left w:val="single" w:sz="4" w:space="0" w:color="999999"/>
@@ -12526,7 +12551,7 @@
         </w:tc>
         <w:tc>
           <w:tcPr>
-            <w:tcW w:w="5861" w:type="dxa"/>
+            <w:tcW w:w="5862" w:type="dxa"/>
             <w:tcBorders>
               <w:top w:val="single" w:sz="4" w:space="0" w:color="999999"/>
               <w:left w:val="single" w:sz="4" w:space="0" w:color="999999"/>
@@ -12599,7 +12624,7 @@
         </w:tc>
         <w:tc>
           <w:tcPr>
-            <w:tcW w:w="5861" w:type="dxa"/>
+            <w:tcW w:w="5862" w:type="dxa"/>
             <w:tcBorders>
               <w:top w:val="single" w:sz="4" w:space="0" w:color="999999"/>
               <w:left w:val="single" w:sz="4" w:space="0" w:color="999999"/>
@@ -12643,7 +12668,9 @@
         </w:rPr>
       </w:pPr>
       <w:r>
-        <w:rPr/>
+        <w:rPr>
+          <w:rFonts w:ascii="DejaVu Serif" w:hAnsi="DejaVu Serif"/>
+        </w:rPr>
       </w:r>
     </w:p>
     <w:p>
@@ -12670,7 +12697,9 @@
         </w:rPr>
       </w:pPr>
       <w:r>
-        <w:rPr/>
+        <w:rPr>
+          <w:rFonts w:ascii="DejaVu Serif" w:hAnsi="DejaVu Serif"/>
+        </w:rPr>
       </w:r>
     </w:p>
     <w:p>
@@ -12681,7 +12710,7 @@
       </w:pPr>
       <w:r>
         <w:drawing>
-          <wp:anchor behindDoc="0" distT="0" distB="0" distL="0" distR="0" simplePos="0" locked="0" layoutInCell="0" allowOverlap="1" relativeHeight="3">
+          <wp:anchor distT="0" distB="0" distL="0" distR="0" simplePos="0" relativeHeight="3" behindDoc="0" locked="0" layoutInCell="0" allowOverlap="1">
             <wp:simplePos x="0" y="0"/>
             <wp:positionH relativeFrom="column">
               <wp:posOffset>-9525</wp:posOffset>
@@ -12692,7 +12721,7 @@
             <wp:extent cx="6219825" cy="6219825"/>
             <wp:effectExtent l="0" t="0" r="0" b="0"/>
             <wp:wrapSquare wrapText="largest"/>
-            <wp:docPr id="2" name="Image2" descr=""/>
+            <wp:docPr id="2" name="Image2"/>
             <wp:cNvGraphicFramePr>
               <a:graphicFrameLocks xmlns:a="http://schemas.openxmlformats.org/drawingml/2006/main" noChangeAspect="1"/>
             </wp:cNvGraphicFramePr>
@@ -12700,7 +12729,7 @@
               <a:graphicData uri="http://schemas.openxmlformats.org/drawingml/2006/picture">
                 <pic:pic xmlns:pic="http://schemas.openxmlformats.org/drawingml/2006/picture">
                   <pic:nvPicPr>
-                    <pic:cNvPr id="2" name="Image2" descr=""/>
+                    <pic:cNvPr id="2" name="Image2"/>
                     <pic:cNvPicPr>
                       <a:picLocks noChangeAspect="1" noChangeArrowheads="1"/>
                     </pic:cNvPicPr>
@@ -12796,7 +12825,7 @@
       </w:tblPr>
       <w:tblGrid>
         <w:gridCol w:w="2369"/>
-        <w:gridCol w:w="6990"/>
+        <w:gridCol w:w="6991"/>
       </w:tblGrid>
       <w:tr>
         <w:trPr>
@@ -12839,7 +12868,7 @@
         </w:tc>
         <w:tc>
           <w:tcPr>
-            <w:tcW w:w="6990" w:type="dxa"/>
+            <w:tcW w:w="6991" w:type="dxa"/>
             <w:tcBorders>
               <w:top w:val="single" w:sz="4" w:space="0" w:color="999999"/>
               <w:left w:val="single" w:sz="4" w:space="0" w:color="999999"/>
@@ -12912,7 +12941,7 @@
         </w:tc>
         <w:tc>
           <w:tcPr>
-            <w:tcW w:w="6990" w:type="dxa"/>
+            <w:tcW w:w="6991" w:type="dxa"/>
             <w:tcBorders>
               <w:top w:val="single" w:sz="4" w:space="0" w:color="999999"/>
               <w:left w:val="single" w:sz="4" w:space="0" w:color="999999"/>
@@ -12985,7 +13014,7 @@
         </w:tc>
         <w:tc>
           <w:tcPr>
-            <w:tcW w:w="6990" w:type="dxa"/>
+            <w:tcW w:w="6991" w:type="dxa"/>
             <w:tcBorders>
               <w:top w:val="single" w:sz="4" w:space="0" w:color="999999"/>
               <w:left w:val="single" w:sz="4" w:space="0" w:color="999999"/>
@@ -13058,7 +13087,7 @@
         </w:tc>
         <w:tc>
           <w:tcPr>
-            <w:tcW w:w="6990" w:type="dxa"/>
+            <w:tcW w:w="6991" w:type="dxa"/>
             <w:tcBorders>
               <w:top w:val="single" w:sz="4" w:space="0" w:color="999999"/>
               <w:left w:val="single" w:sz="4" w:space="0" w:color="999999"/>
@@ -13131,7 +13160,7 @@
         </w:tc>
         <w:tc>
           <w:tcPr>
-            <w:tcW w:w="6990" w:type="dxa"/>
+            <w:tcW w:w="6991" w:type="dxa"/>
             <w:tcBorders>
               <w:top w:val="single" w:sz="4" w:space="0" w:color="999999"/>
               <w:left w:val="single" w:sz="4" w:space="0" w:color="999999"/>
@@ -13204,7 +13233,7 @@
         </w:tc>
         <w:tc>
           <w:tcPr>
-            <w:tcW w:w="6990" w:type="dxa"/>
+            <w:tcW w:w="6991" w:type="dxa"/>
             <w:tcBorders>
               <w:top w:val="single" w:sz="4" w:space="0" w:color="999999"/>
               <w:left w:val="single" w:sz="4" w:space="0" w:color="999999"/>
@@ -13277,7 +13306,7 @@
         </w:tc>
         <w:tc>
           <w:tcPr>
-            <w:tcW w:w="6990" w:type="dxa"/>
+            <w:tcW w:w="6991" w:type="dxa"/>
             <w:tcBorders>
               <w:top w:val="single" w:sz="4" w:space="0" w:color="999999"/>
               <w:left w:val="single" w:sz="4" w:space="0" w:color="999999"/>
@@ -13350,7 +13379,7 @@
         </w:tc>
         <w:tc>
           <w:tcPr>
-            <w:tcW w:w="6990" w:type="dxa"/>
+            <w:tcW w:w="6991" w:type="dxa"/>
             <w:tcBorders>
               <w:top w:val="single" w:sz="4" w:space="0" w:color="999999"/>
               <w:left w:val="single" w:sz="4" w:space="0" w:color="999999"/>
@@ -13423,7 +13452,7 @@
         </w:tc>
         <w:tc>
           <w:tcPr>
-            <w:tcW w:w="6990" w:type="dxa"/>
+            <w:tcW w:w="6991" w:type="dxa"/>
             <w:tcBorders>
               <w:top w:val="single" w:sz="4" w:space="0" w:color="999999"/>
               <w:left w:val="single" w:sz="4" w:space="0" w:color="999999"/>
@@ -13496,7 +13525,7 @@
         </w:tc>
         <w:tc>
           <w:tcPr>
-            <w:tcW w:w="6990" w:type="dxa"/>
+            <w:tcW w:w="6991" w:type="dxa"/>
             <w:tcBorders>
               <w:top w:val="single" w:sz="4" w:space="0" w:color="999999"/>
               <w:left w:val="single" w:sz="4" w:space="0" w:color="999999"/>
@@ -13569,7 +13598,7 @@
         </w:tc>
         <w:tc>
           <w:tcPr>
-            <w:tcW w:w="6990" w:type="dxa"/>
+            <w:tcW w:w="6991" w:type="dxa"/>
             <w:tcBorders>
               <w:top w:val="single" w:sz="4" w:space="0" w:color="999999"/>
               <w:left w:val="single" w:sz="4" w:space="0" w:color="999999"/>
@@ -13642,7 +13671,7 @@
         </w:tc>
         <w:tc>
           <w:tcPr>
-            <w:tcW w:w="6990" w:type="dxa"/>
+            <w:tcW w:w="6991" w:type="dxa"/>
             <w:tcBorders>
               <w:top w:val="single" w:sz="4" w:space="0" w:color="999999"/>
               <w:left w:val="single" w:sz="4" w:space="0" w:color="999999"/>
@@ -13715,7 +13744,7 @@
         </w:tc>
         <w:tc>
           <w:tcPr>
-            <w:tcW w:w="6990" w:type="dxa"/>
+            <w:tcW w:w="6991" w:type="dxa"/>
             <w:tcBorders>
               <w:top w:val="single" w:sz="4" w:space="0" w:color="999999"/>
               <w:left w:val="single" w:sz="4" w:space="0" w:color="999999"/>
@@ -13788,7 +13817,7 @@
         </w:tc>
         <w:tc>
           <w:tcPr>
-            <w:tcW w:w="6990" w:type="dxa"/>
+            <w:tcW w:w="6991" w:type="dxa"/>
             <w:tcBorders>
               <w:top w:val="single" w:sz="4" w:space="0" w:color="999999"/>
               <w:left w:val="single" w:sz="4" w:space="0" w:color="999999"/>
@@ -13861,7 +13890,7 @@
         </w:tc>
         <w:tc>
           <w:tcPr>
-            <w:tcW w:w="6990" w:type="dxa"/>
+            <w:tcW w:w="6991" w:type="dxa"/>
             <w:tcBorders>
               <w:top w:val="single" w:sz="4" w:space="0" w:color="999999"/>
               <w:left w:val="single" w:sz="4" w:space="0" w:color="999999"/>
@@ -13934,7 +13963,7 @@
         </w:tc>
         <w:tc>
           <w:tcPr>
-            <w:tcW w:w="6990" w:type="dxa"/>
+            <w:tcW w:w="6991" w:type="dxa"/>
             <w:tcBorders>
               <w:top w:val="single" w:sz="4" w:space="0" w:color="999999"/>
               <w:left w:val="single" w:sz="4" w:space="0" w:color="999999"/>
@@ -14007,7 +14036,7 @@
         </w:tc>
         <w:tc>
           <w:tcPr>
-            <w:tcW w:w="6990" w:type="dxa"/>
+            <w:tcW w:w="6991" w:type="dxa"/>
             <w:tcBorders>
               <w:top w:val="single" w:sz="4" w:space="0" w:color="999999"/>
               <w:left w:val="single" w:sz="4" w:space="0" w:color="999999"/>
@@ -14080,7 +14109,7 @@
         </w:tc>
         <w:tc>
           <w:tcPr>
-            <w:tcW w:w="6990" w:type="dxa"/>
+            <w:tcW w:w="6991" w:type="dxa"/>
             <w:tcBorders>
               <w:top w:val="single" w:sz="4" w:space="0" w:color="999999"/>
               <w:left w:val="single" w:sz="4" w:space="0" w:color="999999"/>
@@ -14153,7 +14182,7 @@
         </w:tc>
         <w:tc>
           <w:tcPr>
-            <w:tcW w:w="6990" w:type="dxa"/>
+            <w:tcW w:w="6991" w:type="dxa"/>
             <w:tcBorders>
               <w:top w:val="single" w:sz="4" w:space="0" w:color="999999"/>
               <w:left w:val="single" w:sz="4" w:space="0" w:color="999999"/>
@@ -14226,7 +14255,7 @@
         </w:tc>
         <w:tc>
           <w:tcPr>
-            <w:tcW w:w="6990" w:type="dxa"/>
+            <w:tcW w:w="6991" w:type="dxa"/>
             <w:tcBorders>
               <w:top w:val="single" w:sz="4" w:space="0" w:color="999999"/>
               <w:left w:val="single" w:sz="4" w:space="0" w:color="999999"/>
@@ -14299,7 +14328,7 @@
         </w:tc>
         <w:tc>
           <w:tcPr>
-            <w:tcW w:w="6990" w:type="dxa"/>
+            <w:tcW w:w="6991" w:type="dxa"/>
             <w:tcBorders>
               <w:top w:val="single" w:sz="4" w:space="0" w:color="999999"/>
               <w:left w:val="single" w:sz="4" w:space="0" w:color="999999"/>
@@ -14680,7 +14709,7 @@
     </w:r>
     <w:r>
       <w:rPr/>
-      <w:t>29</w:t>
+      <w:t>30</w:t>
     </w:r>
     <w:r>
       <w:rPr/>
@@ -14708,7 +14737,7 @@
     </w:r>
     <w:r>
       <w:rPr/>
-      <w:t>29</w:t>
+      <w:t>30</w:t>
     </w:r>
     <w:r>
       <w:rPr/>
@@ -14748,7 +14777,7 @@
     </w:r>
     <w:r>
       <w:rPr/>
-      <w:t>29</w:t>
+      <w:t>30</w:t>
     </w:r>
     <w:r>
       <w:rPr/>
@@ -14776,7 +14805,7 @@
     </w:r>
     <w:r>
       <w:rPr/>
-      <w:t>29</w:t>
+      <w:t>30</w:t>
     </w:r>
     <w:r>
       <w:rPr/>
@@ -16233,24 +16262,6 @@
     <w:lvlOverride w:ilvl="0">
       <w:startOverride w:val="1"/>
     </w:lvlOverride>
-  </w:num>
-  <w:num w:numId="13">
-    <w:abstractNumId w:val="5"/>
-  </w:num>
-  <w:num w:numId="14">
-    <w:abstractNumId w:val="5"/>
-  </w:num>
-  <w:num w:numId="15">
-    <w:abstractNumId w:val="5"/>
-  </w:num>
-  <w:num w:numId="16">
-    <w:abstractNumId w:val="5"/>
-  </w:num>
-  <w:num w:numId="17">
-    <w:abstractNumId w:val="5"/>
-  </w:num>
-  <w:num w:numId="18">
-    <w:abstractNumId w:val="5"/>
   </w:num>
 </w:numbering>
 </file>
@@ -16388,8 +16399,8 @@
       <w:u w:val="single"/>
     </w:rPr>
   </w:style>
-  <w:style w:type="character" w:styleId="FootnoteCharacters">
-    <w:name w:val="Footnote Characters"/>
+  <w:style w:type="character" w:styleId="FootnoteCharactersuser">
+    <w:name w:val="Footnote Characters (user)"/>
     <w:uiPriority w:val="99"/>
     <w:semiHidden/>
     <w:unhideWhenUsed/>
@@ -16398,8 +16409,8 @@
       <w:vertAlign w:val="superscript"/>
     </w:rPr>
   </w:style>
-  <w:style w:type="character" w:styleId="FootnoteCharactersuser">
-    <w:name w:val="Footnote Characters (user)"/>
+  <w:style w:type="character" w:styleId="FootnoteCharacters">
+    <w:name w:val="Footnote Characters"/>
     <w:qFormat/>
     <w:rPr>
       <w:vertAlign w:val="superscript"/>
@@ -16423,8 +16434,8 @@
       <w:szCs w:val="20"/>
     </w:rPr>
   </w:style>
-  <w:style w:type="character" w:styleId="EndnoteCharacters">
-    <w:name w:val="Endnote Characters"/>
+  <w:style w:type="character" w:styleId="EndnoteCharactersuser">
+    <w:name w:val="Endnote Characters (user)"/>
     <w:uiPriority w:val="99"/>
     <w:semiHidden/>
     <w:unhideWhenUsed/>
@@ -16433,8 +16444,8 @@
       <w:vertAlign w:val="superscript"/>
     </w:rPr>
   </w:style>
-  <w:style w:type="character" w:styleId="EndnoteCharactersuser">
-    <w:name w:val="Endnote Characters (user)"/>
+  <w:style w:type="character" w:styleId="EndnoteCharacters">
+    <w:name w:val="Endnote Characters"/>
     <w:qFormat/>
     <w:rPr>
       <w:vertAlign w:val="superscript"/>
@@ -16458,15 +16469,15 @@
       <w:szCs w:val="20"/>
     </w:rPr>
   </w:style>
-  <w:style w:type="character" w:styleId="Bullets">
-    <w:name w:val="Bullets"/>
+  <w:style w:type="character" w:styleId="Bulletsuser">
+    <w:name w:val="Bullets (user)"/>
     <w:qFormat/>
     <w:rPr>
       <w:rFonts w:ascii="OpenSymbol" w:hAnsi="OpenSymbol" w:eastAsia="OpenSymbol" w:cs="OpenSymbol"/>
     </w:rPr>
   </w:style>
-  <w:style w:type="character" w:styleId="Bulletsuser">
-    <w:name w:val="Bullets (user)"/>
+  <w:style w:type="character" w:styleId="Bullets">
+    <w:name w:val="Bullets"/>
     <w:qFormat/>
     <w:rPr>
       <w:rFonts w:ascii="OpenSymbol" w:hAnsi="OpenSymbol" w:eastAsia="OpenSymbol" w:cs="OpenSymbol"/>
@@ -16663,37 +16674,37 @@
         <a:srgbClr val="000000"/>
       </a:dk1>
       <a:lt1>
-        <a:srgbClr val="ffffff"/>
+        <a:srgbClr val="FFFFFF"/>
       </a:lt1>
       <a:dk2>
         <a:srgbClr val="000000"/>
       </a:dk2>
       <a:lt2>
-        <a:srgbClr val="ffffff"/>
+        <a:srgbClr val="FFFFFF"/>
       </a:lt2>
       <a:accent1>
-        <a:srgbClr val="18a303"/>
+        <a:srgbClr val="18A303"/>
       </a:accent1>
       <a:accent2>
-        <a:srgbClr val="0369a3"/>
+        <a:srgbClr val="0369A3"/>
       </a:accent2>
       <a:accent3>
-        <a:srgbClr val="a33e03"/>
+        <a:srgbClr val="A33E03"/>
       </a:accent3>
       <a:accent4>
-        <a:srgbClr val="8e03a3"/>
+        <a:srgbClr val="8E03A3"/>
       </a:accent4>
       <a:accent5>
-        <a:srgbClr val="c99c00"/>
+        <a:srgbClr val="C99C00"/>
       </a:accent5>
       <a:accent6>
-        <a:srgbClr val="c9211e"/>
+        <a:srgbClr val="C9211E"/>
       </a:accent6>
       <a:hlink>
-        <a:srgbClr val="0000ee"/>
+        <a:srgbClr val="0000EE"/>
       </a:hlink>
       <a:folHlink>
-        <a:srgbClr val="551a8b"/>
+        <a:srgbClr val="551A8B"/>
       </a:folHlink>
     </a:clrScheme>
     <a:fontScheme name="Office">

</xml_diff>